<commit_message>
school-thesis: Arial, black headings via make-reference.py; site screenshots + generator script
</commit_message>
<xml_diff>
--- a/doctypes/school-thesis/reference.docx
+++ b/doctypes/school-thesis/reference.docx
@@ -485,7 +485,7 @@
   <w:docDefaults>
     <w:rPrDefault>
       <w:rPr>
-        <w:rFonts w:asciiTheme="minorHAnsi" w:eastAsiaTheme="minorEastAsia" w:hAnsiTheme="minorHAnsi" w:cstheme="minorBidi"/>
+        <w:rFonts w:ascii="Arial" w:hAnsi="Arial" w:cs="Arial" w:eastAsia="Arial"/>
         <w:sz w:val="24"/>
         <w:szCs w:val="24"/>
         <w:lang w:val="en-US" w:eastAsia="zh-CN" w:bidi="ar-SA"/>
@@ -539,7 +539,7 @@
       <w:jc w:val="center"/>
     </w:pPr>
     <w:rPr>
-      <w:rFonts w:asciiTheme="majorHAnsi" w:eastAsiaTheme="majorEastAsia" w:hAnsiTheme="majorHAnsi" w:cstheme="majorBidi"/>
+      <w:rFonts w:ascii="Arial" w:hAnsi="Arial" w:cs="Arial" w:eastAsia="Arial"/>
       <w:sz w:val="56"/>
       <w:szCs w:val="56"/>
     </w:rPr>
@@ -551,7 +551,7 @@
     <w:uiPriority w:val="10"/>
     <w:rsid w:val="00A10FD9"/>
     <w:rPr>
-      <w:rFonts w:asciiTheme="majorHAnsi" w:eastAsiaTheme="majorEastAsia" w:hAnsiTheme="majorHAnsi" w:cstheme="majorBidi"/>
+      <w:rFonts w:ascii="Arial" w:hAnsi="Arial" w:cs="Arial" w:eastAsia="Arial"/>
       <w:sz w:val="56"/>
       <w:szCs w:val="56"/>
     </w:rPr>
@@ -570,7 +570,7 @@
       </w:numPr>
     </w:pPr>
     <w:rPr>
-      <w:rFonts w:eastAsiaTheme="majorEastAsia" w:cstheme="majorBidi"/>
+      <w:rFonts w:ascii="Arial" w:hAnsi="Arial" w:cs="Arial" w:eastAsia="Arial"/>
       <w:spacing w:val="15"/>
       <w:sz w:val="28"/>
       <w:szCs w:val="28"/>
@@ -583,7 +583,7 @@
     <w:uiPriority w:val="11"/>
     <w:rsid w:val="00A10FD9"/>
     <w:rPr>
-      <w:rFonts w:eastAsiaTheme="majorEastAsia" w:cstheme="majorBidi"/>
+      <w:rFonts w:ascii="Arial" w:hAnsi="Arial" w:cs="Arial" w:eastAsia="Arial"/>
       <w:color w:val="595959" w:themeColor="text1" w:themeTint="A6"/>
       <w:spacing w:val="15"/>
       <w:sz w:val="28"/>
@@ -673,8 +673,8 @@
       <w:outlineLvl w:val="0"/>
     </w:pPr>
     <w:rPr>
-      <w:rFonts w:asciiTheme="majorHAnsi" w:eastAsiaTheme="majorEastAsia" w:hAnsiTheme="majorHAnsi" w:cstheme="majorBidi"/>
-      <w:color w:val="0F4761" w:themeColor="accent1" w:themeShade="BF"/>
+      <w:rFonts w:ascii="Arial" w:hAnsi="Arial" w:cs="Arial" w:eastAsia="Arial"/>
+      <w:color w:val="000000"/>
       <w:sz w:val="40"/>
       <w:szCs w:val="40"/>
     </w:rPr>
@@ -696,8 +696,8 @@
       <w:outlineLvl w:val="1"/>
     </w:pPr>
     <w:rPr>
-      <w:rFonts w:asciiTheme="majorHAnsi" w:eastAsiaTheme="majorEastAsia" w:hAnsiTheme="majorHAnsi" w:cstheme="majorBidi"/>
-      <w:color w:val="0F4761" w:themeColor="accent1" w:themeShade="BF"/>
+      <w:rFonts w:ascii="Arial" w:hAnsi="Arial" w:cs="Arial" w:eastAsia="Arial"/>
+      <w:color w:val="000000"/>
       <w:sz w:val="32"/>
       <w:szCs w:val="32"/>
     </w:rPr>
@@ -719,8 +719,8 @@
       <w:outlineLvl w:val="2"/>
     </w:pPr>
     <w:rPr>
-      <w:rFonts w:eastAsiaTheme="majorEastAsia" w:cstheme="majorBidi"/>
-      <w:color w:val="0F4761" w:themeColor="accent1" w:themeShade="BF"/>
+      <w:rFonts w:ascii="Arial" w:hAnsi="Arial" w:cs="Arial" w:eastAsia="Arial"/>
+      <w:color w:val="000000"/>
       <w:sz w:val="28"/>
       <w:szCs w:val="28"/>
     </w:rPr>
@@ -742,10 +742,10 @@
       <w:outlineLvl w:val="3"/>
     </w:pPr>
     <w:rPr>
-      <w:rFonts w:eastAsiaTheme="majorEastAsia" w:cstheme="majorBidi"/>
+      <w:rFonts w:ascii="Arial" w:hAnsi="Arial" w:cs="Arial" w:eastAsia="Arial"/>
       <w:i/>
       <w:iCs/>
-      <w:color w:val="0F4761" w:themeColor="accent1" w:themeShade="BF"/>
+      <w:color w:val="000000"/>
     </w:rPr>
   </w:style>
   <w:style w:type="paragraph" w:styleId="Heading5">
@@ -765,8 +765,8 @@
       <w:outlineLvl w:val="4"/>
     </w:pPr>
     <w:rPr>
-      <w:rFonts w:eastAsiaTheme="majorEastAsia" w:cstheme="majorBidi"/>
-      <w:color w:val="0F4761" w:themeColor="accent1" w:themeShade="BF"/>
+      <w:rFonts w:ascii="Arial" w:hAnsi="Arial" w:cs="Arial" w:eastAsia="Arial"/>
+      <w:color w:val="000000"/>
     </w:rPr>
   </w:style>
   <w:style w:type="paragraph" w:styleId="Heading6">
@@ -786,7 +786,7 @@
       <w:outlineLvl w:val="5"/>
     </w:pPr>
     <w:rPr>
-      <w:rFonts w:eastAsiaTheme="majorEastAsia" w:cstheme="majorBidi"/>
+      <w:rFonts w:ascii="Arial" w:hAnsi="Arial" w:cs="Arial" w:eastAsia="Arial"/>
       <w:i/>
       <w:iCs/>
       <w:color w:val="595959" w:themeColor="text1" w:themeTint="A6"/>
@@ -809,7 +809,7 @@
       <w:outlineLvl w:val="6"/>
     </w:pPr>
     <w:rPr>
-      <w:rFonts w:eastAsiaTheme="majorEastAsia" w:cstheme="majorBidi"/>
+      <w:rFonts w:ascii="Arial" w:hAnsi="Arial" w:cs="Arial" w:eastAsia="Arial"/>
       <w:color w:val="595959" w:themeColor="text1" w:themeTint="A6"/>
     </w:rPr>
   </w:style>
@@ -830,7 +830,7 @@
       <w:outlineLvl w:val="7"/>
     </w:pPr>
     <w:rPr>
-      <w:rFonts w:eastAsiaTheme="majorEastAsia" w:cstheme="majorBidi"/>
+      <w:rFonts w:ascii="Arial" w:hAnsi="Arial" w:cs="Arial" w:eastAsia="Arial"/>
       <w:i/>
       <w:iCs/>
       <w:color w:val="272727" w:themeColor="text1" w:themeTint="D8"/>
@@ -853,7 +853,7 @@
       <w:outlineLvl w:val="8"/>
     </w:pPr>
     <w:rPr>
-      <w:rFonts w:eastAsiaTheme="majorEastAsia" w:cstheme="majorBidi"/>
+      <w:rFonts w:ascii="Arial" w:hAnsi="Arial" w:cs="Arial" w:eastAsia="Arial"/>
       <w:color w:val="272727" w:themeColor="text1" w:themeTint="D8"/>
     </w:rPr>
   </w:style>
@@ -864,8 +864,8 @@
     <w:uiPriority w:val="9"/>
     <w:rsid w:val="00A10FD9"/>
     <w:rPr>
-      <w:rFonts w:asciiTheme="majorHAnsi" w:eastAsiaTheme="majorEastAsia" w:hAnsiTheme="majorHAnsi" w:cstheme="majorBidi"/>
-      <w:color w:val="0F4761" w:themeColor="accent1" w:themeShade="BF"/>
+      <w:rFonts w:ascii="Arial" w:hAnsi="Arial" w:cs="Arial" w:eastAsia="Arial"/>
+      <w:color w:val="000000"/>
       <w:sz w:val="40"/>
       <w:szCs w:val="40"/>
     </w:rPr>
@@ -878,8 +878,8 @@
     <w:semiHidden/>
     <w:rsid w:val="00A10FD9"/>
     <w:rPr>
-      <w:rFonts w:asciiTheme="majorHAnsi" w:eastAsiaTheme="majorEastAsia" w:hAnsiTheme="majorHAnsi" w:cstheme="majorBidi"/>
-      <w:color w:val="0F4761" w:themeColor="accent1" w:themeShade="BF"/>
+      <w:rFonts w:ascii="Arial" w:hAnsi="Arial" w:cs="Arial" w:eastAsia="Arial"/>
+      <w:color w:val="000000"/>
       <w:sz w:val="32"/>
       <w:szCs w:val="32"/>
     </w:rPr>
@@ -892,8 +892,8 @@
     <w:semiHidden/>
     <w:rsid w:val="00A10FD9"/>
     <w:rPr>
-      <w:rFonts w:eastAsiaTheme="majorEastAsia" w:cstheme="majorBidi"/>
-      <w:color w:val="0F4761" w:themeColor="accent1" w:themeShade="BF"/>
+      <w:rFonts w:ascii="Arial" w:hAnsi="Arial" w:cs="Arial" w:eastAsia="Arial"/>
+      <w:color w:val="000000"/>
       <w:sz w:val="28"/>
       <w:szCs w:val="28"/>
     </w:rPr>
@@ -906,10 +906,10 @@
     <w:semiHidden/>
     <w:rsid w:val="00A10FD9"/>
     <w:rPr>
-      <w:rFonts w:eastAsiaTheme="majorEastAsia" w:cstheme="majorBidi"/>
+      <w:rFonts w:ascii="Arial" w:hAnsi="Arial" w:cs="Arial" w:eastAsia="Arial"/>
       <w:i/>
       <w:iCs/>
-      <w:color w:val="0F4761" w:themeColor="accent1" w:themeShade="BF"/>
+      <w:color w:val="000000"/>
     </w:rPr>
   </w:style>
   <w:style w:type="character" w:customStyle="1" w:styleId="Heading5Char">
@@ -920,8 +920,8 @@
     <w:semiHidden/>
     <w:rsid w:val="00A10FD9"/>
     <w:rPr>
-      <w:rFonts w:eastAsiaTheme="majorEastAsia" w:cstheme="majorBidi"/>
-      <w:color w:val="0F4761" w:themeColor="accent1" w:themeShade="BF"/>
+      <w:rFonts w:ascii="Arial" w:hAnsi="Arial" w:cs="Arial" w:eastAsia="Arial"/>
+      <w:color w:val="000000"/>
     </w:rPr>
   </w:style>
   <w:style w:type="character" w:customStyle="1" w:styleId="Heading6Char">
@@ -932,7 +932,7 @@
     <w:semiHidden/>
     <w:rsid w:val="00A10FD9"/>
     <w:rPr>
-      <w:rFonts w:eastAsiaTheme="majorEastAsia" w:cstheme="majorBidi"/>
+      <w:rFonts w:ascii="Arial" w:hAnsi="Arial" w:cs="Arial" w:eastAsia="Arial"/>
       <w:i/>
       <w:iCs/>
       <w:color w:val="595959" w:themeColor="text1" w:themeTint="A6"/>
@@ -946,7 +946,7 @@
     <w:semiHidden/>
     <w:rsid w:val="00A10FD9"/>
     <w:rPr>
-      <w:rFonts w:eastAsiaTheme="majorEastAsia" w:cstheme="majorBidi"/>
+      <w:rFonts w:ascii="Arial" w:hAnsi="Arial" w:cs="Arial" w:eastAsia="Arial"/>
       <w:color w:val="595959" w:themeColor="text1" w:themeTint="A6"/>
     </w:rPr>
   </w:style>
@@ -958,7 +958,7 @@
     <w:semiHidden/>
     <w:rsid w:val="00A10FD9"/>
     <w:rPr>
-      <w:rFonts w:eastAsiaTheme="majorEastAsia" w:cstheme="majorBidi"/>
+      <w:rFonts w:ascii="Arial" w:hAnsi="Arial" w:cs="Arial" w:eastAsia="Arial"/>
       <w:i/>
       <w:iCs/>
       <w:color w:val="272727" w:themeColor="text1" w:themeTint="D8"/>
@@ -972,7 +972,7 @@
     <w:semiHidden/>
     <w:rsid w:val="00A10FD9"/>
     <w:rPr>
-      <w:rFonts w:eastAsiaTheme="majorEastAsia" w:cstheme="majorBidi"/>
+      <w:rFonts w:ascii="Arial" w:hAnsi="Arial" w:cs="Arial" w:eastAsia="Arial"/>
       <w:color w:val="272727" w:themeColor="text1" w:themeTint="D8"/>
     </w:rPr>
   </w:style>
@@ -1096,7 +1096,7 @@
     <w:name w:val="Verbatim Char"/>
     <w:basedOn w:val="BodyTextChar"/>
     <w:rPr>
-      <w:rFonts w:ascii="Consolas" w:hAnsi="Consolas"/>
+      <w:rFonts w:ascii="Arial" w:hAnsi="Arial" w:cs="Arial" w:eastAsia="Arial"/>
       <w:sz w:val="22"/>
     </w:rPr>
   </w:style>
@@ -1115,7 +1115,7 @@
     <w:name w:val="Hyperlink"/>
     <w:basedOn w:val="BodyTextChar"/>
     <w:rPr>
-      <w:color w:val="4F81BD" w:themeColor="accent1"/>
+      <w:color w:val="000000"/>
     </w:rPr>
   </w:style>
   <w:style w:type="paragraph" w:styleId="TOCHeading">
@@ -1130,10 +1130,10 @@
       <w:outlineLvl w:val="9"/>
     </w:pPr>
     <w:rPr>
-      <w:rFonts w:asciiTheme="majorHAnsi" w:eastAsiaTheme="majorEastAsia" w:hAnsiTheme="majorHAnsi" w:cstheme="majorBidi"/>
+      <w:rFonts w:ascii="Arial" w:hAnsi="Arial" w:cs="Arial" w:eastAsia="Arial"/>
       <w:b w:val="0"/>
       <w:bCs w:val="0"/>
-      <w:color w:val="365F91" w:themeColor="accent1" w:themeShade="BF"/>
+      <w:color w:val="000000"/>
     </w:rPr>
   </w:style>
 </w:styles>

</xml_diff>